<commit_message>
Uniformiza os cenários e aplica página nova por seção longa
Passada de consistência entre os cenários 1 a 9: remoção do número de
telefone do centro toxicológico (não confirmado), monitoramento reforçado
como sugestão de 30 dias a validar pelo responsável técnico, ponteiro
para o Cenário T (graus G1/G2/G3 e modelos-padrão) em todos os cenários.
Pacote de revisão e planilha ajustados. Todos os PDF, Word e fluxogramas
regerados; seções longas começam em página nova, como nos modelos DF.

Co-Authored-By: Claude Sonnet 5.5 <noreply@anthropic.com>
Claude-Session: https://claude.ai/code/session_015N8NW4o2BbADwSCH4ZsDyY
</commit_message>
<xml_diff>
--- a/entregas/plano-contingencia-agua/cenarios/01-contaminacao-cruzada/cenario-1-contaminacao-cruzada-procedimento.docx
+++ b/entregas/plano-contingencia-agua/cenarios/01-contaminacao-cruzada/cenario-1-contaminacao-cruzada-procedimento.docx
@@ -2289,6 +2289,7 @@
     <w:p>
       <w:pPr>
         <w:keepNext/>
+        <w:pageBreakBefore/>
         <w:pBdr>
           <w:bottom w:val="single" w:sz="8" w:space="5" w:color="2F4162"/>
         </w:pBdr>
@@ -2566,7 +2567,27 @@
           <w:color w:val="1F2A37"/>
           <w:sz w:val="20"/>
         </w:rPr>
-        <w:t xml:space="preserve"> (SAMU 192) e informar o produto suspeito. Para orientação toxicológica, o Disque-Intoxicação da Anvisa (0800 722 6001 ⚠ confirmar o número vigente).</w:t>
+        <w:t xml:space="preserve"> (SAMU 192) e informar o produto suspeito. Para orientação toxicológica, o </w:t>
+      </w:r>
+      <w:r>
+        <w:rPr>
+          <w:rFonts w:ascii="Arial" w:hAnsi="Arial" w:cs="Arial" w:eastAsia="Arial"/>
+          <w:b/>
+          <w:i w:val="0"/>
+          <w:color w:val="1F2A37"/>
+          <w:sz w:val="20"/>
+        </w:rPr>
+        <w:t>centro de informação toxicológica</w:t>
+      </w:r>
+      <w:r>
+        <w:rPr>
+          <w:rFonts w:ascii="Arial" w:hAnsi="Arial" w:cs="Arial" w:eastAsia="Arial"/>
+          <w:b w:val="0"/>
+          <w:i w:val="0"/>
+          <w:color w:val="1F2A37"/>
+          <w:sz w:val="20"/>
+        </w:rPr>
+        <w:t xml:space="preserve"> (telefone na ficha ⚠).</w:t>
       </w:r>
     </w:p>
     <w:p>
@@ -3213,53 +3234,48 @@
     </w:p>
     <w:p>
       <w:pPr>
-        <w:tabs>
-          <w:tab w:pos="260" w:val="left"/>
-        </w:tabs>
-        <w:spacing w:after="60" w:before="0" w:line="284" w:lineRule="exact"/>
-        <w:ind w:left="260" w:hanging="260"/>
+        <w:spacing w:after="130" w:before="0" w:line="284" w:lineRule="exact"/>
         <w:jc w:val="both"/>
       </w:pPr>
       <w:r>
         <w:rPr>
           <w:rFonts w:ascii="Arial" w:hAnsi="Arial" w:cs="Arial" w:eastAsia="Arial"/>
-          <w:b w:val="0"/>
-          <w:i w:val="0"/>
-          <w:color w:val="2F4162"/>
-          <w:sz w:val="20"/>
-        </w:rPr>
-        <w:t>1.</w:t>
-        <w:tab/>
-      </w:r>
-      <w:r>
-        <w:rPr>
-          <w:rFonts w:ascii="Arial" w:hAnsi="Arial" w:cs="Arial" w:eastAsia="Arial"/>
-          <w:b w:val="0"/>
-          <w:i w:val="0"/>
-          <w:color w:val="1F2A37"/>
-          <w:sz w:val="20"/>
-        </w:rPr>
-        <w:t xml:space="preserve">Escalar pela escada </w:t>
-      </w:r>
-      <w:r>
-        <w:rPr>
-          <w:rFonts w:ascii="Arial" w:hAnsi="Arial" w:cs="Arial" w:eastAsia="Arial"/>
           <w:b/>
           <w:i w:val="0"/>
           <w:color w:val="1F2A37"/>
           <w:sz w:val="20"/>
         </w:rPr>
-        <w:t>nível 1 → 2 → 3</w:t>
-      </w:r>
-      <w:r>
-        <w:rPr>
-          <w:rFonts w:ascii="Arial" w:hAnsi="Arial" w:cs="Arial" w:eastAsia="Arial"/>
-          <w:b w:val="0"/>
-          <w:i w:val="0"/>
-          <w:color w:val="1F2A37"/>
-          <w:sz w:val="20"/>
-        </w:rPr>
-        <w:t>, na ordem da ficha.</w:t>
+        <w:t>Comunicação:</w:t>
+      </w:r>
+      <w:r>
+        <w:rPr>
+          <w:rFonts w:ascii="Arial" w:hAnsi="Arial" w:cs="Arial" w:eastAsia="Arial"/>
+          <w:b w:val="0"/>
+          <w:i w:val="0"/>
+          <w:color w:val="1F2A37"/>
+          <w:sz w:val="20"/>
+        </w:rPr>
+        <w:t xml:space="preserve"> classifique o grau da ocorrência (G1, G2 ou G3) e siga o </w:t>
+      </w:r>
+      <w:r>
+        <w:rPr>
+          <w:rFonts w:ascii="Arial" w:hAnsi="Arial" w:cs="Arial" w:eastAsia="Arial"/>
+          <w:b/>
+          <w:i w:val="0"/>
+          <w:color w:val="1F2A37"/>
+          <w:sz w:val="20"/>
+        </w:rPr>
+        <w:t>Cenário T</w:t>
+      </w:r>
+      <w:r>
+        <w:rPr>
+          <w:rFonts w:ascii="Arial" w:hAnsi="Arial" w:cs="Arial" w:eastAsia="Arial"/>
+          <w:b w:val="0"/>
+          <w:i w:val="0"/>
+          <w:color w:val="1F2A37"/>
+          <w:sz w:val="20"/>
+        </w:rPr>
+        <w:t>: quem avisa quem, em que prazo e com que modelo.</w:t>
       </w:r>
     </w:p>
     <w:p>
@@ -3279,108 +3295,38 @@
           <w:color w:val="2F4162"/>
           <w:sz w:val="20"/>
         </w:rPr>
-        <w:t>2.</w:t>
+        <w:t>1.</w:t>
         <w:tab/>
       </w:r>
       <w:r>
         <w:rPr>
           <w:rFonts w:ascii="Arial" w:hAnsi="Arial" w:cs="Arial" w:eastAsia="Arial"/>
+          <w:b w:val="0"/>
+          <w:i w:val="0"/>
+          <w:color w:val="1F2A37"/>
+          <w:sz w:val="20"/>
+        </w:rPr>
+        <w:t xml:space="preserve">Escalar pela escada </w:t>
+      </w:r>
+      <w:r>
+        <w:rPr>
+          <w:rFonts w:ascii="Arial" w:hAnsi="Arial" w:cs="Arial" w:eastAsia="Arial"/>
           <w:b/>
           <w:i w:val="0"/>
           <w:color w:val="1F2A37"/>
           <w:sz w:val="20"/>
         </w:rPr>
-        <w:t>Acionar o fornecedor de tratamento químico</w:t>
-      </w:r>
-      <w:r>
-        <w:rPr>
-          <w:rFonts w:ascii="Arial" w:hAnsi="Arial" w:cs="Arial" w:eastAsia="Arial"/>
-          <w:b w:val="0"/>
-          <w:i w:val="0"/>
-          <w:color w:val="1F2A37"/>
-          <w:sz w:val="20"/>
-        </w:rPr>
-        <w:t xml:space="preserve"> e pedir: </w:t>
-      </w:r>
-      <w:r>
-        <w:rPr>
-          <w:rFonts w:ascii="Arial" w:hAnsi="Arial" w:cs="Arial" w:eastAsia="Arial"/>
-          <w:b/>
-          <w:i w:val="0"/>
-          <w:color w:val="1F2A37"/>
-          <w:sz w:val="20"/>
-        </w:rPr>
-        <w:t>FISPQ</w:t>
-      </w:r>
-      <w:r>
-        <w:rPr>
-          <w:rFonts w:ascii="Arial" w:hAnsi="Arial" w:cs="Arial" w:eastAsia="Arial"/>
-          <w:b w:val="0"/>
-          <w:i w:val="0"/>
-          <w:color w:val="1F2A37"/>
-          <w:sz w:val="20"/>
-        </w:rPr>
-        <w:t xml:space="preserve"> de cada produto dosado, </w:t>
-      </w:r>
-      <w:r>
-        <w:rPr>
-          <w:rFonts w:ascii="Arial" w:hAnsi="Arial" w:cs="Arial" w:eastAsia="Arial"/>
-          <w:b/>
-          <w:i w:val="0"/>
-          <w:color w:val="1F2A37"/>
-          <w:sz w:val="20"/>
-        </w:rPr>
-        <w:t>composição</w:t>
-      </w:r>
-      <w:r>
-        <w:rPr>
-          <w:rFonts w:ascii="Arial" w:hAnsi="Arial" w:cs="Arial" w:eastAsia="Arial"/>
-          <w:b w:val="0"/>
-          <w:i w:val="0"/>
-          <w:color w:val="1F2A37"/>
-          <w:sz w:val="20"/>
-        </w:rPr>
-        <w:t xml:space="preserve">, </w:t>
-      </w:r>
-      <w:r>
-        <w:rPr>
-          <w:rFonts w:ascii="Arial" w:hAnsi="Arial" w:cs="Arial" w:eastAsia="Arial"/>
-          <w:b/>
-          <w:i w:val="0"/>
-          <w:color w:val="1F2A37"/>
-          <w:sz w:val="20"/>
-        </w:rPr>
-        <w:t>concentração</w:t>
-      </w:r>
-      <w:r>
-        <w:rPr>
-          <w:rFonts w:ascii="Arial" w:hAnsi="Arial" w:cs="Arial" w:eastAsia="Arial"/>
-          <w:b w:val="0"/>
-          <w:i w:val="0"/>
-          <w:color w:val="1F2A37"/>
-          <w:sz w:val="20"/>
-        </w:rPr>
-        <w:t xml:space="preserve"> e </w:t>
-      </w:r>
-      <w:r>
-        <w:rPr>
-          <w:rFonts w:ascii="Arial" w:hAnsi="Arial" w:cs="Arial" w:eastAsia="Arial"/>
-          <w:b/>
-          <w:i w:val="0"/>
-          <w:color w:val="1F2A37"/>
-          <w:sz w:val="20"/>
-        </w:rPr>
-        <w:t>corante</w:t>
-      </w:r>
-      <w:r>
-        <w:rPr>
-          <w:rFonts w:ascii="Arial" w:hAnsi="Arial" w:cs="Arial" w:eastAsia="Arial"/>
-          <w:b w:val="0"/>
-          <w:i w:val="0"/>
-          <w:color w:val="1F2A37"/>
-          <w:sz w:val="20"/>
-        </w:rPr>
-        <w:t xml:space="preserve"> usados no circuito.</w:t>
+        <w:t>nível 1 → 2 → 3</w:t>
+      </w:r>
+      <w:r>
+        <w:rPr>
+          <w:rFonts w:ascii="Arial" w:hAnsi="Arial" w:cs="Arial" w:eastAsia="Arial"/>
+          <w:b w:val="0"/>
+          <w:i w:val="0"/>
+          <w:color w:val="1F2A37"/>
+          <w:sz w:val="20"/>
+        </w:rPr>
+        <w:t>, na ordem da ficha.</w:t>
       </w:r>
     </w:p>
     <w:p>
@@ -3400,7 +3346,7 @@
           <w:color w:val="2F4162"/>
           <w:sz w:val="20"/>
         </w:rPr>
-        <w:t>3.</w:t>
+        <w:t>2.</w:t>
         <w:tab/>
       </w:r>
       <w:r>
@@ -3411,17 +3357,17 @@
           <w:color w:val="1F2A37"/>
           <w:sz w:val="20"/>
         </w:rPr>
-        <w:t>Acionar o fornecedor de hidráulica</w:t>
-      </w:r>
-      <w:r>
-        <w:rPr>
-          <w:rFonts w:ascii="Arial" w:hAnsi="Arial" w:cs="Arial" w:eastAsia="Arial"/>
-          <w:b w:val="0"/>
-          <w:i w:val="0"/>
-          <w:color w:val="1F2A37"/>
-          <w:sz w:val="20"/>
-        </w:rPr>
-        <w:t xml:space="preserve"> e, se o síndico decidir, o </w:t>
+        <w:t>Acionar o fornecedor de tratamento químico</w:t>
+      </w:r>
+      <w:r>
+        <w:rPr>
+          <w:rFonts w:ascii="Arial" w:hAnsi="Arial" w:cs="Arial" w:eastAsia="Arial"/>
+          <w:b w:val="0"/>
+          <w:i w:val="0"/>
+          <w:color w:val="1F2A37"/>
+          <w:sz w:val="20"/>
+        </w:rPr>
+        <w:t xml:space="preserve"> e pedir: </w:t>
       </w:r>
       <w:r>
         <w:rPr>
@@ -3431,17 +3377,77 @@
           <w:color w:val="1F2A37"/>
           <w:sz w:val="20"/>
         </w:rPr>
-        <w:t>consultor especialista</w:t>
-      </w:r>
-      <w:r>
-        <w:rPr>
-          <w:rFonts w:ascii="Arial" w:hAnsi="Arial" w:cs="Arial" w:eastAsia="Arial"/>
-          <w:b w:val="0"/>
-          <w:i w:val="0"/>
-          <w:color w:val="1F2A37"/>
-          <w:sz w:val="20"/>
-        </w:rPr>
-        <w:t>.</w:t>
+        <w:t>FISPQ</w:t>
+      </w:r>
+      <w:r>
+        <w:rPr>
+          <w:rFonts w:ascii="Arial" w:hAnsi="Arial" w:cs="Arial" w:eastAsia="Arial"/>
+          <w:b w:val="0"/>
+          <w:i w:val="0"/>
+          <w:color w:val="1F2A37"/>
+          <w:sz w:val="20"/>
+        </w:rPr>
+        <w:t xml:space="preserve"> de cada produto dosado, </w:t>
+      </w:r>
+      <w:r>
+        <w:rPr>
+          <w:rFonts w:ascii="Arial" w:hAnsi="Arial" w:cs="Arial" w:eastAsia="Arial"/>
+          <w:b/>
+          <w:i w:val="0"/>
+          <w:color w:val="1F2A37"/>
+          <w:sz w:val="20"/>
+        </w:rPr>
+        <w:t>composição</w:t>
+      </w:r>
+      <w:r>
+        <w:rPr>
+          <w:rFonts w:ascii="Arial" w:hAnsi="Arial" w:cs="Arial" w:eastAsia="Arial"/>
+          <w:b w:val="0"/>
+          <w:i w:val="0"/>
+          <w:color w:val="1F2A37"/>
+          <w:sz w:val="20"/>
+        </w:rPr>
+        <w:t xml:space="preserve">, </w:t>
+      </w:r>
+      <w:r>
+        <w:rPr>
+          <w:rFonts w:ascii="Arial" w:hAnsi="Arial" w:cs="Arial" w:eastAsia="Arial"/>
+          <w:b/>
+          <w:i w:val="0"/>
+          <w:color w:val="1F2A37"/>
+          <w:sz w:val="20"/>
+        </w:rPr>
+        <w:t>concentração</w:t>
+      </w:r>
+      <w:r>
+        <w:rPr>
+          <w:rFonts w:ascii="Arial" w:hAnsi="Arial" w:cs="Arial" w:eastAsia="Arial"/>
+          <w:b w:val="0"/>
+          <w:i w:val="0"/>
+          <w:color w:val="1F2A37"/>
+          <w:sz w:val="20"/>
+        </w:rPr>
+        <w:t xml:space="preserve"> e </w:t>
+      </w:r>
+      <w:r>
+        <w:rPr>
+          <w:rFonts w:ascii="Arial" w:hAnsi="Arial" w:cs="Arial" w:eastAsia="Arial"/>
+          <w:b/>
+          <w:i w:val="0"/>
+          <w:color w:val="1F2A37"/>
+          <w:sz w:val="20"/>
+        </w:rPr>
+        <w:t>corante</w:t>
+      </w:r>
+      <w:r>
+        <w:rPr>
+          <w:rFonts w:ascii="Arial" w:hAnsi="Arial" w:cs="Arial" w:eastAsia="Arial"/>
+          <w:b w:val="0"/>
+          <w:i w:val="0"/>
+          <w:color w:val="1F2A37"/>
+          <w:sz w:val="20"/>
+        </w:rPr>
+        <w:t xml:space="preserve"> usados no circuito.</w:t>
       </w:r>
     </w:p>
     <w:p>
@@ -3461,7 +3467,7 @@
           <w:color w:val="2F4162"/>
           <w:sz w:val="20"/>
         </w:rPr>
-        <w:t>4.</w:t>
+        <w:t>3.</w:t>
         <w:tab/>
       </w:r>
       <w:r>
@@ -3472,17 +3478,17 @@
           <w:color w:val="1F2A37"/>
           <w:sz w:val="20"/>
         </w:rPr>
-        <w:t>Síndico decide</w:t>
-      </w:r>
-      <w:r>
-        <w:rPr>
-          <w:rFonts w:ascii="Arial" w:hAnsi="Arial" w:cs="Arial" w:eastAsia="Arial"/>
-          <w:b w:val="0"/>
-          <w:i w:val="0"/>
-          <w:color w:val="1F2A37"/>
-          <w:sz w:val="20"/>
-        </w:rPr>
-        <w:t xml:space="preserve"> a comunicação aos locatários e as </w:t>
+        <w:t>Acionar o fornecedor de hidráulica</w:t>
+      </w:r>
+      <w:r>
+        <w:rPr>
+          <w:rFonts w:ascii="Arial" w:hAnsi="Arial" w:cs="Arial" w:eastAsia="Arial"/>
+          <w:b w:val="0"/>
+          <w:i w:val="0"/>
+          <w:color w:val="1F2A37"/>
+          <w:sz w:val="20"/>
+        </w:rPr>
+        <w:t xml:space="preserve"> e, se o síndico decidir, o </w:t>
       </w:r>
       <w:r>
         <w:rPr>
@@ -3492,57 +3498,17 @@
           <w:color w:val="1F2A37"/>
           <w:sz w:val="20"/>
         </w:rPr>
-        <w:t>notificações externas</w:t>
-      </w:r>
-      <w:r>
-        <w:rPr>
-          <w:rFonts w:ascii="Arial" w:hAnsi="Arial" w:cs="Arial" w:eastAsia="Arial"/>
-          <w:b w:val="0"/>
-          <w:i w:val="0"/>
-          <w:color w:val="1F2A37"/>
-          <w:sz w:val="20"/>
-        </w:rPr>
-        <w:t xml:space="preserve">: vigilância sanitária e, se o prédio é abastecido </w:t>
-      </w:r>
-      <w:r>
-        <w:rPr>
-          <w:rFonts w:ascii="Arial" w:hAnsi="Arial" w:cs="Arial" w:eastAsia="Arial"/>
-          <w:b/>
-          <w:i w:val="0"/>
-          <w:color w:val="1F2A37"/>
-          <w:sz w:val="20"/>
-        </w:rPr>
-        <w:t>direto pela rede pública</w:t>
-      </w:r>
-      <w:r>
-        <w:rPr>
-          <w:rFonts w:ascii="Arial" w:hAnsi="Arial" w:cs="Arial" w:eastAsia="Arial"/>
-          <w:b w:val="0"/>
-          <w:i w:val="0"/>
-          <w:color w:val="1F2A37"/>
-          <w:sz w:val="20"/>
-        </w:rPr>
-        <w:t xml:space="preserve"> (sem cisterna) e a contaminação pode ter chegado ao ramal, a </w:t>
-      </w:r>
-      <w:r>
-        <w:rPr>
-          <w:rFonts w:ascii="Arial" w:hAnsi="Arial" w:cs="Arial" w:eastAsia="Arial"/>
-          <w:b/>
-          <w:i w:val="0"/>
-          <w:color w:val="1F2A37"/>
-          <w:sz w:val="20"/>
-        </w:rPr>
-        <w:t>concessionária</w:t>
-      </w:r>
-      <w:r>
-        <w:rPr>
-          <w:rFonts w:ascii="Arial" w:hAnsi="Arial" w:cs="Arial" w:eastAsia="Arial"/>
-          <w:b w:val="0"/>
-          <w:i w:val="0"/>
-          <w:color w:val="1F2A37"/>
-          <w:sz w:val="20"/>
-        </w:rPr>
-        <w:t xml:space="preserve"> ⚠. Em caso de dúvida jurídica, acionar o jurídico.</w:t>
+        <w:t>consultor especialista</w:t>
+      </w:r>
+      <w:r>
+        <w:rPr>
+          <w:rFonts w:ascii="Arial" w:hAnsi="Arial" w:cs="Arial" w:eastAsia="Arial"/>
+          <w:b w:val="0"/>
+          <w:i w:val="0"/>
+          <w:color w:val="1F2A37"/>
+          <w:sz w:val="20"/>
+        </w:rPr>
+        <w:t>.</w:t>
       </w:r>
     </w:p>
     <w:p>
@@ -3562,54 +3528,88 @@
           <w:color w:val="2F4162"/>
           <w:sz w:val="20"/>
         </w:rPr>
-        <w:t>5.</w:t>
+        <w:t>4.</w:t>
         <w:tab/>
       </w:r>
       <w:r>
         <w:rPr>
           <w:rFonts w:ascii="Arial" w:hAnsi="Arial" w:cs="Arial" w:eastAsia="Arial"/>
-          <w:b w:val="0"/>
-          <w:i w:val="0"/>
-          <w:color w:val="1F2A37"/>
-          <w:sz w:val="20"/>
-        </w:rPr>
-        <w:t xml:space="preserve">Comunicar por escrito (modelo na seção 7). </w:t>
-      </w:r>
-      <w:r>
-        <w:rPr>
-          <w:rFonts w:ascii="Arial" w:hAnsi="Arial" w:cs="Arial" w:eastAsia="Arial"/>
           <w:b/>
           <w:i w:val="0"/>
           <w:color w:val="1F2A37"/>
           <w:sz w:val="20"/>
         </w:rPr>
-        <w:t>Não afirmar a causa</w:t>
-      </w:r>
-      <w:r>
-        <w:rPr>
-          <w:rFonts w:ascii="Arial" w:hAnsi="Arial" w:cs="Arial" w:eastAsia="Arial"/>
-          <w:b w:val="0"/>
-          <w:i w:val="0"/>
-          <w:color w:val="1F2A37"/>
-          <w:sz w:val="20"/>
-        </w:rPr>
-        <w:t xml:space="preserve"> antes de confirmada; informar o que se sabe, o que se faz e quando haverá nova informação.</w:t>
-      </w:r>
-    </w:p>
-    <w:p>
-      <w:pPr>
-        <w:keepNext/>
-        <w:spacing w:after="80" w:before="240" w:line="280" w:lineRule="exact"/>
-      </w:pPr>
+        <w:t>Síndico decide</w:t>
+      </w:r>
+      <w:r>
+        <w:rPr>
+          <w:rFonts w:ascii="Arial" w:hAnsi="Arial" w:cs="Arial" w:eastAsia="Arial"/>
+          <w:b w:val="0"/>
+          <w:i w:val="0"/>
+          <w:color w:val="1F2A37"/>
+          <w:sz w:val="20"/>
+        </w:rPr>
+        <w:t xml:space="preserve"> a comunicação aos locatários e as </w:t>
+      </w:r>
       <w:r>
         <w:rPr>
           <w:rFonts w:ascii="Arial" w:hAnsi="Arial" w:cs="Arial" w:eastAsia="Arial"/>
           <w:b/>
           <w:i w:val="0"/>
           <w:color w:val="1F2A37"/>
-          <w:sz w:val="22"/>
-        </w:rPr>
-        <w:t>Fase 3 — Mapear e coletar evidência (T+30 min a T+4 h)</w:t>
+          <w:sz w:val="20"/>
+        </w:rPr>
+        <w:t>notificações externas</w:t>
+      </w:r>
+      <w:r>
+        <w:rPr>
+          <w:rFonts w:ascii="Arial" w:hAnsi="Arial" w:cs="Arial" w:eastAsia="Arial"/>
+          <w:b w:val="0"/>
+          <w:i w:val="0"/>
+          <w:color w:val="1F2A37"/>
+          <w:sz w:val="20"/>
+        </w:rPr>
+        <w:t xml:space="preserve">: vigilância sanitária e, se o prédio é abastecido </w:t>
+      </w:r>
+      <w:r>
+        <w:rPr>
+          <w:rFonts w:ascii="Arial" w:hAnsi="Arial" w:cs="Arial" w:eastAsia="Arial"/>
+          <w:b/>
+          <w:i w:val="0"/>
+          <w:color w:val="1F2A37"/>
+          <w:sz w:val="20"/>
+        </w:rPr>
+        <w:t>direto pela rede pública</w:t>
+      </w:r>
+      <w:r>
+        <w:rPr>
+          <w:rFonts w:ascii="Arial" w:hAnsi="Arial" w:cs="Arial" w:eastAsia="Arial"/>
+          <w:b w:val="0"/>
+          <w:i w:val="0"/>
+          <w:color w:val="1F2A37"/>
+          <w:sz w:val="20"/>
+        </w:rPr>
+        <w:t xml:space="preserve"> (sem cisterna) e a contaminação pode ter chegado ao ramal, a </w:t>
+      </w:r>
+      <w:r>
+        <w:rPr>
+          <w:rFonts w:ascii="Arial" w:hAnsi="Arial" w:cs="Arial" w:eastAsia="Arial"/>
+          <w:b/>
+          <w:i w:val="0"/>
+          <w:color w:val="1F2A37"/>
+          <w:sz w:val="20"/>
+        </w:rPr>
+        <w:t>concessionária</w:t>
+      </w:r>
+      <w:r>
+        <w:rPr>
+          <w:rFonts w:ascii="Arial" w:hAnsi="Arial" w:cs="Arial" w:eastAsia="Arial"/>
+          <w:b w:val="0"/>
+          <w:i w:val="0"/>
+          <w:color w:val="1F2A37"/>
+          <w:sz w:val="20"/>
+        </w:rPr>
+        <w:t xml:space="preserve"> ⚠. Em caso de dúvida jurídica, acionar o jurídico.</w:t>
       </w:r>
     </w:p>
     <w:p>
@@ -3629,48 +3629,54 @@
           <w:color w:val="2F4162"/>
           <w:sz w:val="20"/>
         </w:rPr>
-        <w:t>1.</w:t>
+        <w:t>5.</w:t>
         <w:tab/>
       </w:r>
       <w:r>
         <w:rPr>
           <w:rFonts w:ascii="Arial" w:hAnsi="Arial" w:cs="Arial" w:eastAsia="Arial"/>
+          <w:b w:val="0"/>
+          <w:i w:val="0"/>
+          <w:color w:val="1F2A37"/>
+          <w:sz w:val="20"/>
+        </w:rPr>
+        <w:t xml:space="preserve">Comunicar por escrito (modelo na seção 7). </w:t>
+      </w:r>
+      <w:r>
+        <w:rPr>
+          <w:rFonts w:ascii="Arial" w:hAnsi="Arial" w:cs="Arial" w:eastAsia="Arial"/>
           <w:b/>
           <w:i w:val="0"/>
           <w:color w:val="1F2A37"/>
           <w:sz w:val="20"/>
         </w:rPr>
-        <w:t>Mapear a extensão:</w:t>
-      </w:r>
-      <w:r>
-        <w:rPr>
-          <w:rFonts w:ascii="Arial" w:hAnsi="Arial" w:cs="Arial" w:eastAsia="Arial"/>
-          <w:b w:val="0"/>
-          <w:i w:val="0"/>
-          <w:color w:val="1F2A37"/>
-          <w:sz w:val="20"/>
-        </w:rPr>
-        <w:t xml:space="preserve"> quais andares, prumadas, reservatórios (cisterna, caixa superior) e pontos de consumo estão afetados. Em cada ponto, abrir a torneira devagar e </w:t>
-      </w:r>
+        <w:t>Não afirmar a causa</w:t>
+      </w:r>
+      <w:r>
+        <w:rPr>
+          <w:rFonts w:ascii="Arial" w:hAnsi="Arial" w:cs="Arial" w:eastAsia="Arial"/>
+          <w:b w:val="0"/>
+          <w:i w:val="0"/>
+          <w:color w:val="1F2A37"/>
+          <w:sz w:val="20"/>
+        </w:rPr>
+        <w:t xml:space="preserve"> antes de confirmada; informar o que se sabe, o que se faz e quando haverá nova informação.</w:t>
+      </w:r>
+    </w:p>
+    <w:p>
+      <w:pPr>
+        <w:keepNext/>
+        <w:spacing w:after="80" w:before="240" w:line="280" w:lineRule="exact"/>
+      </w:pPr>
       <w:r>
         <w:rPr>
           <w:rFonts w:ascii="Arial" w:hAnsi="Arial" w:cs="Arial" w:eastAsia="Arial"/>
           <w:b/>
           <w:i w:val="0"/>
           <w:color w:val="1F2A37"/>
-          <w:sz w:val="20"/>
-        </w:rPr>
-        <w:t>olhar contra fundo branco em recipiente transparente</w:t>
-      </w:r>
-      <w:r>
-        <w:rPr>
-          <w:rFonts w:ascii="Arial" w:hAnsi="Arial" w:cs="Arial" w:eastAsia="Arial"/>
-          <w:b w:val="0"/>
-          <w:i w:val="0"/>
-          <w:color w:val="1F2A37"/>
-          <w:sz w:val="20"/>
-        </w:rPr>
-        <w:t xml:space="preserve"> (cor, turbidez, odor). Anotar em planta ou na ficha.</w:t>
+          <w:sz w:val="22"/>
+        </w:rPr>
+        <w:t>Fase 3 — Mapear e coletar evidência (T+30 min a T+4 h)</w:t>
       </w:r>
     </w:p>
     <w:p>
@@ -3690,6 +3696,67 @@
           <w:color w:val="2F4162"/>
           <w:sz w:val="20"/>
         </w:rPr>
+        <w:t>1.</w:t>
+        <w:tab/>
+      </w:r>
+      <w:r>
+        <w:rPr>
+          <w:rFonts w:ascii="Arial" w:hAnsi="Arial" w:cs="Arial" w:eastAsia="Arial"/>
+          <w:b/>
+          <w:i w:val="0"/>
+          <w:color w:val="1F2A37"/>
+          <w:sz w:val="20"/>
+        </w:rPr>
+        <w:t>Mapear a extensão:</w:t>
+      </w:r>
+      <w:r>
+        <w:rPr>
+          <w:rFonts w:ascii="Arial" w:hAnsi="Arial" w:cs="Arial" w:eastAsia="Arial"/>
+          <w:b w:val="0"/>
+          <w:i w:val="0"/>
+          <w:color w:val="1F2A37"/>
+          <w:sz w:val="20"/>
+        </w:rPr>
+        <w:t xml:space="preserve"> quais andares, prumadas, reservatórios (cisterna, caixa superior) e pontos de consumo estão afetados. Em cada ponto, abrir a torneira devagar e </w:t>
+      </w:r>
+      <w:r>
+        <w:rPr>
+          <w:rFonts w:ascii="Arial" w:hAnsi="Arial" w:cs="Arial" w:eastAsia="Arial"/>
+          <w:b/>
+          <w:i w:val="0"/>
+          <w:color w:val="1F2A37"/>
+          <w:sz w:val="20"/>
+        </w:rPr>
+        <w:t>olhar contra fundo branco em recipiente transparente</w:t>
+      </w:r>
+      <w:r>
+        <w:rPr>
+          <w:rFonts w:ascii="Arial" w:hAnsi="Arial" w:cs="Arial" w:eastAsia="Arial"/>
+          <w:b w:val="0"/>
+          <w:i w:val="0"/>
+          <w:color w:val="1F2A37"/>
+          <w:sz w:val="20"/>
+        </w:rPr>
+        <w:t xml:space="preserve"> (cor, turbidez, odor). Anotar em planta ou na ficha.</w:t>
+      </w:r>
+    </w:p>
+    <w:p>
+      <w:pPr>
+        <w:tabs>
+          <w:tab w:pos="260" w:val="left"/>
+        </w:tabs>
+        <w:spacing w:after="60" w:before="0" w:line="284" w:lineRule="exact"/>
+        <w:ind w:left="260" w:hanging="260"/>
+        <w:jc w:val="both"/>
+      </w:pPr>
+      <w:r>
+        <w:rPr>
+          <w:rFonts w:ascii="Arial" w:hAnsi="Arial" w:cs="Arial" w:eastAsia="Arial"/>
+          <w:b w:val="0"/>
+          <w:i w:val="0"/>
+          <w:color w:val="2F4162"/>
+          <w:sz w:val="20"/>
+        </w:rPr>
         <w:t>2.</w:t>
         <w:tab/>
       </w:r>
@@ -4892,7 +4959,7 @@
           <w:color w:val="1F2A37"/>
           <w:sz w:val="20"/>
         </w:rPr>
-        <w:t xml:space="preserve"> por período definido pelo consultor ⚠ (sugestão: ronda diária na torneira sentinela, com registro, por 30 dias).</w:t>
+        <w:t xml:space="preserve"> por período definido pelo responsável técnico ⚠ (sugestão: ronda diária na torneira sentinela, com registro, por 30 dias).</w:t>
       </w:r>
     </w:p>
     <w:p>
@@ -5138,6 +5205,7 @@
     <w:p>
       <w:pPr>
         <w:keepNext/>
+        <w:pageBreakBefore/>
         <w:pBdr>
           <w:bottom w:val="single" w:sz="8" w:space="5" w:color="2F4162"/>
         </w:pBdr>
@@ -8434,6 +8502,7 @@
     <w:p>
       <w:pPr>
         <w:keepNext/>
+        <w:pageBreakBefore/>
         <w:pBdr>
           <w:bottom w:val="single" w:sz="8" w:space="5" w:color="2F4162"/>
         </w:pBdr>
@@ -8854,6 +8923,122 @@
           <w:sz w:val="27"/>
         </w:rPr>
         <w:t>7. Modelos de comunicação</w:t>
+      </w:r>
+    </w:p>
+    <w:p>
+      <w:pPr>
+        <w:spacing w:after="130" w:before="0" w:line="284" w:lineRule="exact"/>
+        <w:jc w:val="both"/>
+      </w:pPr>
+      <w:r>
+        <w:rPr>
+          <w:rFonts w:ascii="Arial" w:hAnsi="Arial" w:cs="Arial" w:eastAsia="Arial"/>
+          <w:b w:val="0"/>
+          <w:i w:val="0"/>
+          <w:color w:val="1F2A37"/>
+          <w:sz w:val="20"/>
+        </w:rPr>
+        <w:t xml:space="preserve">Os </w:t>
+      </w:r>
+      <w:r>
+        <w:rPr>
+          <w:rFonts w:ascii="Arial" w:hAnsi="Arial" w:cs="Arial" w:eastAsia="Arial"/>
+          <w:b/>
+          <w:i w:val="0"/>
+          <w:color w:val="1F2A37"/>
+          <w:sz w:val="20"/>
+        </w:rPr>
+        <w:t>modelos-padrão</w:t>
+      </w:r>
+      <w:r>
+        <w:rPr>
+          <w:rFonts w:ascii="Arial" w:hAnsi="Arial" w:cs="Arial" w:eastAsia="Arial"/>
+          <w:b w:val="0"/>
+          <w:i w:val="0"/>
+          <w:color w:val="1F2A37"/>
+          <w:sz w:val="20"/>
+        </w:rPr>
+        <w:t xml:space="preserve"> de aviso (9.1 a 9.11), a </w:t>
+      </w:r>
+      <w:r>
+        <w:rPr>
+          <w:rFonts w:ascii="Arial" w:hAnsi="Arial" w:cs="Arial" w:eastAsia="Arial"/>
+          <w:b/>
+          <w:i w:val="0"/>
+          <w:color w:val="1F2A37"/>
+          <w:sz w:val="20"/>
+        </w:rPr>
+        <w:t>classificação G1, G2 e G3</w:t>
+      </w:r>
+      <w:r>
+        <w:rPr>
+          <w:rFonts w:ascii="Arial" w:hAnsi="Arial" w:cs="Arial" w:eastAsia="Arial"/>
+          <w:b w:val="0"/>
+          <w:i w:val="0"/>
+          <w:color w:val="1F2A37"/>
+          <w:sz w:val="20"/>
+        </w:rPr>
+        <w:t xml:space="preserve"> e a </w:t>
+      </w:r>
+      <w:r>
+        <w:rPr>
+          <w:rFonts w:ascii="Arial" w:hAnsi="Arial" w:cs="Arial" w:eastAsia="Arial"/>
+          <w:b/>
+          <w:i w:val="0"/>
+          <w:color w:val="1F2A37"/>
+          <w:sz w:val="20"/>
+        </w:rPr>
+        <w:t>matriz de destinatários</w:t>
+      </w:r>
+      <w:r>
+        <w:rPr>
+          <w:rFonts w:ascii="Arial" w:hAnsi="Arial" w:cs="Arial" w:eastAsia="Arial"/>
+          <w:b w:val="0"/>
+          <w:i w:val="0"/>
+          <w:color w:val="1F2A37"/>
+          <w:sz w:val="20"/>
+        </w:rPr>
+        <w:t xml:space="preserve"> estão no </w:t>
+      </w:r>
+      <w:r>
+        <w:rPr>
+          <w:rFonts w:ascii="Arial" w:hAnsi="Arial" w:cs="Arial" w:eastAsia="Arial"/>
+          <w:b/>
+          <w:i w:val="0"/>
+          <w:color w:val="1F2A37"/>
+          <w:sz w:val="20"/>
+        </w:rPr>
+        <w:t>Cenário T</w:t>
+      </w:r>
+      <w:r>
+        <w:rPr>
+          <w:rFonts w:ascii="Arial" w:hAnsi="Arial" w:cs="Arial" w:eastAsia="Arial"/>
+          <w:b w:val="0"/>
+          <w:i w:val="0"/>
+          <w:color w:val="1F2A37"/>
+          <w:sz w:val="20"/>
+        </w:rPr>
+        <w:t xml:space="preserve">. Os modelos abaixo são </w:t>
+      </w:r>
+      <w:r>
+        <w:rPr>
+          <w:rFonts w:ascii="Arial" w:hAnsi="Arial" w:cs="Arial" w:eastAsia="Arial"/>
+          <w:b/>
+          <w:i w:val="0"/>
+          <w:color w:val="1F2A37"/>
+          <w:sz w:val="20"/>
+        </w:rPr>
+        <w:t>específicos deste cenário</w:t>
+      </w:r>
+      <w:r>
+        <w:rPr>
+          <w:rFonts w:ascii="Arial" w:hAnsi="Arial" w:cs="Arial" w:eastAsia="Arial"/>
+          <w:b w:val="0"/>
+          <w:i w:val="0"/>
+          <w:color w:val="1F2A37"/>
+          <w:sz w:val="20"/>
+        </w:rPr>
+        <w:t>.</w:t>
       </w:r>
     </w:p>
     <w:p>
@@ -10452,17 +10637,17 @@
           <w:color w:val="1F2A37"/>
           <w:sz w:val="20"/>
         </w:rPr>
-        <w:t>Número do Disque-Intoxicação</w:t>
-      </w:r>
-      <w:r>
-        <w:rPr>
-          <w:rFonts w:ascii="Arial" w:hAnsi="Arial" w:cs="Arial" w:eastAsia="Arial"/>
-          <w:b w:val="0"/>
-          <w:i w:val="0"/>
-          <w:color w:val="1F2A37"/>
-          <w:sz w:val="20"/>
-        </w:rPr>
-        <w:t xml:space="preserve"> e demais contatos.</w:t>
+        <w:t>Telefone do centro de informação toxicológica</w:t>
+      </w:r>
+      <w:r>
+        <w:rPr>
+          <w:rFonts w:ascii="Arial" w:hAnsi="Arial" w:cs="Arial" w:eastAsia="Arial"/>
+          <w:b w:val="0"/>
+          <w:i w:val="0"/>
+          <w:color w:val="1F2A37"/>
+          <w:sz w:val="20"/>
+        </w:rPr>
+        <w:t xml:space="preserve"> e demais contatos (na ficha).</w:t>
       </w:r>
     </w:p>
     <w:p>

</xml_diff>